<commit_message>
feat: enhance CLI with multi-URL support, custom title, and output format options; update documentation and improve markdown merging logic
</commit_message>
<xml_diff>
--- a/Templates/template.docx
+++ b/Templates/template.docx
@@ -1582,15 +1582,17 @@
   </w:style>
   <w:style w:type="paragraph" w:styleId="TOCHeading">
     <w:name w:val="TOC Heading"/>
-    <w:basedOn w:val="Heading1"/>
+    <w:basedOn w:val="BodyText"/>
     <w:next w:val="Normal"/>
     <w:uiPriority w:val="39"/>
     <w:unhideWhenUsed/>
     <w:qFormat/>
-    <w:rsid w:val="007C2692"/>
-    <w:pPr>
-      <w:outlineLvl w:val="9"/>
-    </w:pPr>
+    <w:rsid w:val="00DF7F9F"/>
+    <w:rPr>
+      <w:b/>
+      <w:caps/>
+      <w:sz w:val="22"/>
+    </w:rPr>
   </w:style>
   <w:style w:type="paragraph" w:customStyle="1" w:styleId="SourceCode">
     <w:name w:val="Source Code"/>

</xml_diff>

<commit_message>
feat: reduce default TOC depth to 2 for DOCX output; update documentation and CI/CD workflow
</commit_message>
<xml_diff>
--- a/Templates/template.docx
+++ b/Templates/template.docx
@@ -1587,7 +1587,10 @@
     <w:uiPriority w:val="39"/>
     <w:unhideWhenUsed/>
     <w:qFormat/>
-    <w:rsid w:val="00DF7F9F"/>
+    <w:rsid w:val="00157884"/>
+    <w:pPr>
+      <w:pageBreakBefore/>
+    </w:pPr>
     <w:rPr>
       <w:b/>
       <w:caps/>

</xml_diff>

<commit_message>
feat: update MarkdownMerger to include dedicated attribution section and remove subtitle; adjust frontmatter in generated documents
</commit_message>
<xml_diff>
--- a/Templates/template.docx
+++ b/Templates/template.docx
@@ -2,8 +2,16 @@
 <file path=word/document.xml><?xml version="1.0" encoding="utf-8"?>
 <w:document xmlns:wpc="http://schemas.microsoft.com/office/word/2010/wordprocessingCanvas" xmlns:cx="http://schemas.microsoft.com/office/drawing/2014/chartex" xmlns:cx1="http://schemas.microsoft.com/office/drawing/2015/9/8/chartex" xmlns:cx2="http://schemas.microsoft.com/office/drawing/2015/10/21/chartex" xmlns:cx3="http://schemas.microsoft.com/office/drawing/2016/5/9/chartex" xmlns:cx4="http://schemas.microsoft.com/office/drawing/2016/5/10/chartex" xmlns:cx5="http://schemas.microsoft.com/office/drawing/2016/5/11/chartex" xmlns:cx6="http://schemas.microsoft.com/office/drawing/2016/5/12/chartex" xmlns:cx7="http://schemas.microsoft.com/office/drawing/2016/5/13/chartex" xmlns:cx8="http://schemas.microsoft.com/office/drawing/2016/5/14/chartex" xmlns:mc="http://schemas.openxmlformats.org/markup-compatibility/2006" xmlns:aink="http://schemas.microsoft.com/office/drawing/2016/ink" xmlns:am3d="http://schemas.microsoft.com/office/drawing/2017/model3d" xmlns:o="urn:schemas-microsoft-com:office:office" xmlns:oel="http://schemas.microsoft.com/office/2019/extlst" xmlns:r="http://schemas.openxmlformats.org/officeDocument/2006/relationships" xmlns:m="http://schemas.openxmlformats.org/officeDocument/2006/math" xmlns:v="urn:schemas-microsoft-com:vml" xmlns:wp14="http://schemas.microsoft.com/office/word/2010/wordprocessingDrawing" xmlns:wp="http://schemas.openxmlformats.org/drawingml/2006/wordprocessingDrawing" xmlns:w10="urn:schemas-microsoft-com:office:word" xmlns:w="http://schemas.openxmlformats.org/wordprocessingml/2006/main" xmlns:w14="http://schemas.microsoft.com/office/word/2010/wordml" xmlns:w15="http://schemas.microsoft.com/office/word/2012/wordml" xmlns:w16cex="http://schemas.microsoft.com/office/word/2018/wordml/cex" xmlns:w16cid="http://schemas.microsoft.com/office/word/2016/wordml/cid" xmlns:w16="http://schemas.microsoft.com/office/word/2018/wordml" xmlns:w16du="http://schemas.microsoft.com/office/word/2023/wordml/word16du" xmlns:w16sdtdh="http://schemas.microsoft.com/office/word/2020/wordml/sdtdatahash" xmlns:w16sdtfl="http://schemas.microsoft.com/office/word/2024/wordml/sdtformatlock" xmlns:w16se="http://schemas.microsoft.com/office/word/2015/wordml/symex" xmlns:wpg="http://schemas.microsoft.com/office/word/2010/wordprocessingGroup" xmlns:wpi="http://schemas.microsoft.com/office/word/2010/wordprocessingInk" xmlns:wne="http://schemas.microsoft.com/office/word/2006/wordml" xmlns:wps="http://schemas.microsoft.com/office/word/2010/wordprocessingShape" mc:Ignorable="w14 w15 w16se w16cid w16 w16cex w16sdtdh w16sdtfl w16du wp14">
   <w:body>
-    <w:p/>
+    <w:p>
+      <w:bookmarkStart w:id="0" w:name="using-github-copilot-with-python"/>
+      <w:bookmarkStart w:id="1" w:name="summary-18"/>
+      <w:bookmarkStart w:id="2" w:name="provide-feedback-14"/>
+      <w:bookmarkEnd w:id="0"/>
+      <w:bookmarkEnd w:id="1"/>
+      <w:bookmarkEnd w:id="2"/>
+    </w:p>
     <w:sectPr>
+      <w:footerReference w:type="default" r:id="rId7"/>
       <w:footnotePr>
         <w:numRestart w:val="eachSect"/>
       </w:footnotePr>
@@ -15,199 +23,110 @@
 </w:document>
 </file>
 
+<file path=word/endnotes.xml><?xml version="1.0" encoding="utf-8"?>
+<w:endnotes xmlns:wpc="http://schemas.microsoft.com/office/word/2010/wordprocessingCanvas" xmlns:cx="http://schemas.microsoft.com/office/drawing/2014/chartex" xmlns:cx1="http://schemas.microsoft.com/office/drawing/2015/9/8/chartex" xmlns:cx2="http://schemas.microsoft.com/office/drawing/2015/10/21/chartex" xmlns:cx3="http://schemas.microsoft.com/office/drawing/2016/5/9/chartex" xmlns:cx4="http://schemas.microsoft.com/office/drawing/2016/5/10/chartex" xmlns:cx5="http://schemas.microsoft.com/office/drawing/2016/5/11/chartex" xmlns:cx6="http://schemas.microsoft.com/office/drawing/2016/5/12/chartex" xmlns:cx7="http://schemas.microsoft.com/office/drawing/2016/5/13/chartex" xmlns:cx8="http://schemas.microsoft.com/office/drawing/2016/5/14/chartex" xmlns:mc="http://schemas.openxmlformats.org/markup-compatibility/2006" xmlns:aink="http://schemas.microsoft.com/office/drawing/2016/ink" xmlns:am3d="http://schemas.microsoft.com/office/drawing/2017/model3d" xmlns:o="urn:schemas-microsoft-com:office:office" xmlns:oel="http://schemas.microsoft.com/office/2019/extlst" xmlns:r="http://schemas.openxmlformats.org/officeDocument/2006/relationships" xmlns:m="http://schemas.openxmlformats.org/officeDocument/2006/math" xmlns:v="urn:schemas-microsoft-com:vml" xmlns:wp14="http://schemas.microsoft.com/office/word/2010/wordprocessingDrawing" xmlns:wp="http://schemas.openxmlformats.org/drawingml/2006/wordprocessingDrawing" xmlns:w10="urn:schemas-microsoft-com:office:word" xmlns:w="http://schemas.openxmlformats.org/wordprocessingml/2006/main" xmlns:w14="http://schemas.microsoft.com/office/word/2010/wordml" xmlns:w15="http://schemas.microsoft.com/office/word/2012/wordml" xmlns:w16cex="http://schemas.microsoft.com/office/word/2018/wordml/cex" xmlns:w16cid="http://schemas.microsoft.com/office/word/2016/wordml/cid" xmlns:w16="http://schemas.microsoft.com/office/word/2018/wordml" xmlns:w16du="http://schemas.microsoft.com/office/word/2023/wordml/word16du" xmlns:w16sdtdh="http://schemas.microsoft.com/office/word/2020/wordml/sdtdatahash" xmlns:w16sdtfl="http://schemas.microsoft.com/office/word/2024/wordml/sdtformatlock" xmlns:w16se="http://schemas.microsoft.com/office/word/2015/wordml/symex" xmlns:wpg="http://schemas.microsoft.com/office/word/2010/wordprocessingGroup" xmlns:wpi="http://schemas.microsoft.com/office/word/2010/wordprocessingInk" xmlns:wne="http://schemas.microsoft.com/office/word/2006/wordml" xmlns:wps="http://schemas.microsoft.com/office/word/2010/wordprocessingShape" mc:Ignorable="w14 w15 w16se w16cid w16 w16cex w16sdtdh w16sdtfl w16du wp14">
+  <w:endnote w:type="separator" w:id="-1">
+    <w:p>
+      <w:pPr>
+        <w:spacing w:before="0" w:after="0" w:line="240" w:lineRule="auto"/>
+      </w:pPr>
+      <w:r>
+        <w:separator/>
+      </w:r>
+    </w:p>
+  </w:endnote>
+  <w:endnote w:type="continuationSeparator" w:id="0">
+    <w:p>
+      <w:pPr>
+        <w:spacing w:before="0" w:after="0" w:line="240" w:lineRule="auto"/>
+      </w:pPr>
+      <w:r>
+        <w:continuationSeparator/>
+      </w:r>
+    </w:p>
+  </w:endnote>
+</w:endnotes>
+</file>
+
+<file path=word/footer1.xml><?xml version="1.0" encoding="utf-8"?>
+<w:ftr xmlns:wpc="http://schemas.microsoft.com/office/word/2010/wordprocessingCanvas" xmlns:cx="http://schemas.microsoft.com/office/drawing/2014/chartex" xmlns:cx1="http://schemas.microsoft.com/office/drawing/2015/9/8/chartex" xmlns:cx2="http://schemas.microsoft.com/office/drawing/2015/10/21/chartex" xmlns:cx3="http://schemas.microsoft.com/office/drawing/2016/5/9/chartex" xmlns:cx4="http://schemas.microsoft.com/office/drawing/2016/5/10/chartex" xmlns:cx5="http://schemas.microsoft.com/office/drawing/2016/5/11/chartex" xmlns:cx6="http://schemas.microsoft.com/office/drawing/2016/5/12/chartex" xmlns:cx7="http://schemas.microsoft.com/office/drawing/2016/5/13/chartex" xmlns:cx8="http://schemas.microsoft.com/office/drawing/2016/5/14/chartex" xmlns:mc="http://schemas.openxmlformats.org/markup-compatibility/2006" xmlns:aink="http://schemas.microsoft.com/office/drawing/2016/ink" xmlns:am3d="http://schemas.microsoft.com/office/drawing/2017/model3d" xmlns:o="urn:schemas-microsoft-com:office:office" xmlns:oel="http://schemas.microsoft.com/office/2019/extlst" xmlns:r="http://schemas.openxmlformats.org/officeDocument/2006/relationships" xmlns:m="http://schemas.openxmlformats.org/officeDocument/2006/math" xmlns:v="urn:schemas-microsoft-com:vml" xmlns:wp14="http://schemas.microsoft.com/office/word/2010/wordprocessingDrawing" xmlns:wp="http://schemas.openxmlformats.org/drawingml/2006/wordprocessingDrawing" xmlns:w10="urn:schemas-microsoft-com:office:word" xmlns:w="http://schemas.openxmlformats.org/wordprocessingml/2006/main" xmlns:w14="http://schemas.microsoft.com/office/word/2010/wordml" xmlns:w15="http://schemas.microsoft.com/office/word/2012/wordml" xmlns:w16cex="http://schemas.microsoft.com/office/word/2018/wordml/cex" xmlns:w16cid="http://schemas.microsoft.com/office/word/2016/wordml/cid" xmlns:w16="http://schemas.microsoft.com/office/word/2018/wordml" xmlns:w16du="http://schemas.microsoft.com/office/word/2023/wordml/word16du" xmlns:w16sdtdh="http://schemas.microsoft.com/office/word/2020/wordml/sdtdatahash" xmlns:w16sdtfl="http://schemas.microsoft.com/office/word/2024/wordml/sdtformatlock" xmlns:w16se="http://schemas.microsoft.com/office/word/2015/wordml/symex" xmlns:wpg="http://schemas.microsoft.com/office/word/2010/wordprocessingGroup" xmlns:wpi="http://schemas.microsoft.com/office/word/2010/wordprocessingInk" xmlns:wne="http://schemas.microsoft.com/office/word/2006/wordml" xmlns:wps="http://schemas.microsoft.com/office/word/2010/wordprocessingShape" mc:Ignorable="w14 w15 w16se w16cid w16 w16cex w16sdtdh w16sdtfl w16du wp14">
+  <w:p>
+    <w:pPr>
+      <w:pStyle w:val="Footer"/>
+      <w:jc w:val="center"/>
+    </w:pPr>
+  </w:p>
+  <w:sdt>
+    <w:sdtPr>
+      <w:id w:val="-539901121"/>
+      <w:docPartObj>
+        <w:docPartGallery w:val="Page Numbers (Bottom of Page)"/>
+        <w:docPartUnique/>
+      </w:docPartObj>
+    </w:sdtPr>
+    <w:sdtContent>
+      <w:p>
+        <w:pPr>
+          <w:pStyle w:val="Footer"/>
+          <w:jc w:val="center"/>
+        </w:pPr>
+        <w:r>
+          <w:fldChar w:fldCharType="begin"/>
+        </w:r>
+        <w:r>
+          <w:instrText>PAGE   \* MERGEFORMAT</w:instrText>
+        </w:r>
+        <w:r>
+          <w:fldChar w:fldCharType="separate"/>
+        </w:r>
+        <w:r>
+          <w:rPr>
+            <w:lang w:val="it-IT"/>
+          </w:rPr>
+          <w:t>2</w:t>
+        </w:r>
+        <w:r>
+          <w:fldChar w:fldCharType="end"/>
+        </w:r>
+      </w:p>
+    </w:sdtContent>
+  </w:sdt>
+  <w:p>
+    <w:pPr>
+      <w:pStyle w:val="Footer"/>
+    </w:pPr>
+  </w:p>
+</w:ftr>
+</file>
+
+<file path=word/footnotes.xml><?xml version="1.0" encoding="utf-8"?>
+<w:footnotes xmlns:wpc="http://schemas.microsoft.com/office/word/2010/wordprocessingCanvas" xmlns:cx="http://schemas.microsoft.com/office/drawing/2014/chartex" xmlns:cx1="http://schemas.microsoft.com/office/drawing/2015/9/8/chartex" xmlns:cx2="http://schemas.microsoft.com/office/drawing/2015/10/21/chartex" xmlns:cx3="http://schemas.microsoft.com/office/drawing/2016/5/9/chartex" xmlns:cx4="http://schemas.microsoft.com/office/drawing/2016/5/10/chartex" xmlns:cx5="http://schemas.microsoft.com/office/drawing/2016/5/11/chartex" xmlns:cx6="http://schemas.microsoft.com/office/drawing/2016/5/12/chartex" xmlns:cx7="http://schemas.microsoft.com/office/drawing/2016/5/13/chartex" xmlns:cx8="http://schemas.microsoft.com/office/drawing/2016/5/14/chartex" xmlns:mc="http://schemas.openxmlformats.org/markup-compatibility/2006" xmlns:aink="http://schemas.microsoft.com/office/drawing/2016/ink" xmlns:am3d="http://schemas.microsoft.com/office/drawing/2017/model3d" xmlns:o="urn:schemas-microsoft-com:office:office" xmlns:oel="http://schemas.microsoft.com/office/2019/extlst" xmlns:r="http://schemas.openxmlformats.org/officeDocument/2006/relationships" xmlns:m="http://schemas.openxmlformats.org/officeDocument/2006/math" xmlns:v="urn:schemas-microsoft-com:vml" xmlns:wp14="http://schemas.microsoft.com/office/word/2010/wordprocessingDrawing" xmlns:wp="http://schemas.openxmlformats.org/drawingml/2006/wordprocessingDrawing" xmlns:w10="urn:schemas-microsoft-com:office:word" xmlns:w="http://schemas.openxmlformats.org/wordprocessingml/2006/main" xmlns:w14="http://schemas.microsoft.com/office/word/2010/wordml" xmlns:w15="http://schemas.microsoft.com/office/word/2012/wordml" xmlns:w16cex="http://schemas.microsoft.com/office/word/2018/wordml/cex" xmlns:w16cid="http://schemas.microsoft.com/office/word/2016/wordml/cid" xmlns:w16="http://schemas.microsoft.com/office/word/2018/wordml" xmlns:w16du="http://schemas.microsoft.com/office/word/2023/wordml/word16du" xmlns:w16sdtdh="http://schemas.microsoft.com/office/word/2020/wordml/sdtdatahash" xmlns:w16sdtfl="http://schemas.microsoft.com/office/word/2024/wordml/sdtformatlock" xmlns:w16se="http://schemas.microsoft.com/office/word/2015/wordml/symex" xmlns:wpg="http://schemas.microsoft.com/office/word/2010/wordprocessingGroup" xmlns:wpi="http://schemas.microsoft.com/office/word/2010/wordprocessingInk" xmlns:wne="http://schemas.microsoft.com/office/word/2006/wordml" xmlns:wps="http://schemas.microsoft.com/office/word/2010/wordprocessingShape" mc:Ignorable="w14 w15 w16se w16cid w16 w16cex w16sdtdh w16sdtfl w16du wp14">
+  <w:footnote w:type="separator" w:id="-1">
+    <w:p>
+      <w:pPr>
+        <w:spacing w:before="0" w:after="0" w:line="240" w:lineRule="auto"/>
+      </w:pPr>
+      <w:r>
+        <w:separator/>
+      </w:r>
+    </w:p>
+  </w:footnote>
+  <w:footnote w:type="continuationSeparator" w:id="0">
+    <w:p>
+      <w:pPr>
+        <w:spacing w:before="0" w:after="0" w:line="240" w:lineRule="auto"/>
+      </w:pPr>
+      <w:r>
+        <w:continuationSeparator/>
+      </w:r>
+    </w:p>
+  </w:footnote>
+</w:footnotes>
+</file>
+
 <file path=word/numbering.xml><?xml version="1.0" encoding="utf-8"?>
 <w:numbering xmlns:wpc="http://schemas.microsoft.com/office/word/2010/wordprocessingCanvas" xmlns:cx="http://schemas.microsoft.com/office/drawing/2014/chartex" xmlns:cx1="http://schemas.microsoft.com/office/drawing/2015/9/8/chartex" xmlns:cx2="http://schemas.microsoft.com/office/drawing/2015/10/21/chartex" xmlns:cx3="http://schemas.microsoft.com/office/drawing/2016/5/9/chartex" xmlns:cx4="http://schemas.microsoft.com/office/drawing/2016/5/10/chartex" xmlns:cx5="http://schemas.microsoft.com/office/drawing/2016/5/11/chartex" xmlns:cx6="http://schemas.microsoft.com/office/drawing/2016/5/12/chartex" xmlns:cx7="http://schemas.microsoft.com/office/drawing/2016/5/13/chartex" xmlns:cx8="http://schemas.microsoft.com/office/drawing/2016/5/14/chartex" xmlns:mc="http://schemas.openxmlformats.org/markup-compatibility/2006" xmlns:aink="http://schemas.microsoft.com/office/drawing/2016/ink" xmlns:am3d="http://schemas.microsoft.com/office/drawing/2017/model3d" xmlns:o="urn:schemas-microsoft-com:office:office" xmlns:oel="http://schemas.microsoft.com/office/2019/extlst" xmlns:r="http://schemas.openxmlformats.org/officeDocument/2006/relationships" xmlns:m="http://schemas.openxmlformats.org/officeDocument/2006/math" xmlns:v="urn:schemas-microsoft-com:vml" xmlns:wp14="http://schemas.microsoft.com/office/word/2010/wordprocessingDrawing" xmlns:wp="http://schemas.openxmlformats.org/drawingml/2006/wordprocessingDrawing" xmlns:w10="urn:schemas-microsoft-com:office:word" xmlns:w="http://schemas.openxmlformats.org/wordprocessingml/2006/main" xmlns:w14="http://schemas.microsoft.com/office/word/2010/wordml" xmlns:w15="http://schemas.microsoft.com/office/word/2012/wordml" xmlns:w16cex="http://schemas.microsoft.com/office/word/2018/wordml/cex" xmlns:w16cid="http://schemas.microsoft.com/office/word/2016/wordml/cid" xmlns:w16="http://schemas.microsoft.com/office/word/2018/wordml" xmlns:w16du="http://schemas.microsoft.com/office/word/2023/wordml/word16du" xmlns:w16sdtdh="http://schemas.microsoft.com/office/word/2020/wordml/sdtdatahash" xmlns:w16sdtfl="http://schemas.microsoft.com/office/word/2024/wordml/sdtformatlock" xmlns:w16se="http://schemas.microsoft.com/office/word/2015/wordml/symex" xmlns:wpg="http://schemas.microsoft.com/office/word/2010/wordprocessingGroup" xmlns:wpi="http://schemas.microsoft.com/office/word/2010/wordprocessingInk" xmlns:wne="http://schemas.microsoft.com/office/word/2006/wordml" xmlns:wps="http://schemas.microsoft.com/office/word/2010/wordprocessingShape" mc:Ignorable="w14 w15 w16se w16cid w16 w16cex w16sdtdh w16sdtfl w16du wp14">
   <w:abstractNum w:abstractNumId="0" w15:restartNumberingAfterBreak="0">
-    <w:nsid w:val="0000A991"/>
-    <w:multiLevelType w:val="multilevel"/>
-    <w:tmpl w:val="C8282E0C"/>
-    <w:lvl w:ilvl="0">
-      <w:numFmt w:val="bullet"/>
-      <w:lvlText w:val=""/>
-      <w:lvlJc w:val="left"/>
-      <w:pPr>
-        <w:ind w:left="720" w:hanging="360"/>
-      </w:pPr>
-      <w:rPr>
-        <w:rFonts w:ascii="Symbol" w:hAnsi="Symbol" w:cs="Symbol" w:hint="default"/>
-      </w:rPr>
-    </w:lvl>
-    <w:lvl w:ilvl="1">
-      <w:numFmt w:val="bullet"/>
-      <w:lvlText w:val="o"/>
-      <w:lvlJc w:val="left"/>
-      <w:pPr>
-        <w:ind w:left="1440" w:hanging="360"/>
-      </w:pPr>
-      <w:rPr>
-        <w:rFonts w:ascii="Courier New" w:hAnsi="Courier New" w:cs="Courier New" w:hint="default"/>
-      </w:rPr>
-    </w:lvl>
-    <w:lvl w:ilvl="2">
-      <w:numFmt w:val="bullet"/>
-      <w:lvlText w:val=""/>
-      <w:lvlJc w:val="left"/>
-      <w:pPr>
-        <w:ind w:left="2160" w:hanging="360"/>
-      </w:pPr>
-      <w:rPr>
-        <w:rFonts w:ascii="Wingdings" w:hAnsi="Wingdings" w:cs="Wingdings" w:hint="default"/>
-      </w:rPr>
-    </w:lvl>
-    <w:lvl w:ilvl="3">
-      <w:numFmt w:val="bullet"/>
-      <w:lvlText w:val=""/>
-      <w:lvlJc w:val="left"/>
-      <w:pPr>
-        <w:ind w:left="2880" w:hanging="360"/>
-      </w:pPr>
-      <w:rPr>
-        <w:rFonts w:ascii="Symbol" w:hAnsi="Symbol" w:cs="Symbol" w:hint="default"/>
-      </w:rPr>
-    </w:lvl>
-    <w:lvl w:ilvl="4">
-      <w:numFmt w:val="bullet"/>
-      <w:lvlText w:val="o"/>
-      <w:lvlJc w:val="left"/>
-      <w:pPr>
-        <w:ind w:left="3600" w:hanging="360"/>
-      </w:pPr>
-      <w:rPr>
-        <w:rFonts w:ascii="Courier New" w:hAnsi="Courier New" w:cs="Courier New" w:hint="default"/>
-      </w:rPr>
-    </w:lvl>
-    <w:lvl w:ilvl="5">
-      <w:numFmt w:val="bullet"/>
-      <w:lvlText w:val=""/>
-      <w:lvlJc w:val="left"/>
-      <w:pPr>
-        <w:ind w:left="4320" w:hanging="360"/>
-      </w:pPr>
-      <w:rPr>
-        <w:rFonts w:ascii="Wingdings" w:hAnsi="Wingdings" w:cs="Wingdings" w:hint="default"/>
-      </w:rPr>
-    </w:lvl>
-    <w:lvl w:ilvl="6">
-      <w:numFmt w:val="bullet"/>
-      <w:lvlText w:val=""/>
-      <w:lvlJc w:val="left"/>
-      <w:pPr>
-        <w:ind w:left="5040" w:hanging="360"/>
-      </w:pPr>
-      <w:rPr>
-        <w:rFonts w:ascii="Symbol" w:hAnsi="Symbol" w:cs="Symbol" w:hint="default"/>
-      </w:rPr>
-    </w:lvl>
-    <w:lvl w:ilvl="7">
-      <w:numFmt w:val="bullet"/>
-      <w:lvlText w:val="o"/>
-      <w:lvlJc w:val="left"/>
-      <w:pPr>
-        <w:ind w:left="5760" w:hanging="360"/>
-      </w:pPr>
-      <w:rPr>
-        <w:rFonts w:ascii="Courier New" w:hAnsi="Courier New" w:cs="Courier New" w:hint="default"/>
-      </w:rPr>
-    </w:lvl>
-    <w:lvl w:ilvl="8">
-      <w:numFmt w:val="bullet"/>
-      <w:lvlText w:val=""/>
-      <w:lvlJc w:val="left"/>
-      <w:pPr>
-        <w:ind w:left="6480" w:hanging="360"/>
-      </w:pPr>
-      <w:rPr>
-        <w:rFonts w:ascii="Wingdings" w:hAnsi="Wingdings" w:cs="Wingdings" w:hint="default"/>
-      </w:rPr>
-    </w:lvl>
-  </w:abstractNum>
-  <w:abstractNum w:abstractNumId="1" w15:restartNumberingAfterBreak="0">
-    <w:nsid w:val="00A99411"/>
-    <w:multiLevelType w:val="multilevel"/>
-    <w:tmpl w:val="B9FCAD66"/>
-    <w:lvl w:ilvl="0">
-      <w:start w:val="1"/>
-      <w:numFmt w:val="decimal"/>
-      <w:lvlText w:val="%1."/>
-      <w:lvlJc w:val="left"/>
-      <w:pPr>
-        <w:ind w:left="720" w:hanging="360"/>
-      </w:pPr>
-    </w:lvl>
-    <w:lvl w:ilvl="1">
-      <w:start w:val="1"/>
-      <w:numFmt w:val="decimal"/>
-      <w:lvlText w:val="%2."/>
-      <w:lvlJc w:val="left"/>
-      <w:pPr>
-        <w:ind w:left="1440" w:hanging="360"/>
-      </w:pPr>
-    </w:lvl>
-    <w:lvl w:ilvl="2">
-      <w:start w:val="1"/>
-      <w:numFmt w:val="decimal"/>
-      <w:lvlText w:val="%3."/>
-      <w:lvlJc w:val="left"/>
-      <w:pPr>
-        <w:ind w:left="2160" w:hanging="360"/>
-      </w:pPr>
-    </w:lvl>
-    <w:lvl w:ilvl="3">
-      <w:start w:val="1"/>
-      <w:numFmt w:val="decimal"/>
-      <w:lvlText w:val="%4."/>
-      <w:lvlJc w:val="left"/>
-      <w:pPr>
-        <w:ind w:left="2880" w:hanging="360"/>
-      </w:pPr>
-    </w:lvl>
-    <w:lvl w:ilvl="4">
-      <w:start w:val="1"/>
-      <w:numFmt w:val="decimal"/>
-      <w:lvlText w:val="%5."/>
-      <w:lvlJc w:val="left"/>
-      <w:pPr>
-        <w:ind w:left="3600" w:hanging="360"/>
-      </w:pPr>
-    </w:lvl>
-    <w:lvl w:ilvl="5">
-      <w:start w:val="1"/>
-      <w:numFmt w:val="decimal"/>
-      <w:lvlText w:val="%6."/>
-      <w:lvlJc w:val="left"/>
-      <w:pPr>
-        <w:ind w:left="4320" w:hanging="360"/>
-      </w:pPr>
-    </w:lvl>
-    <w:lvl w:ilvl="6">
-      <w:start w:val="1"/>
-      <w:numFmt w:val="decimal"/>
-      <w:lvlText w:val="%7."/>
-      <w:lvlJc w:val="left"/>
-      <w:pPr>
-        <w:ind w:left="5040" w:hanging="360"/>
-      </w:pPr>
-    </w:lvl>
-    <w:lvl w:ilvl="7">
-      <w:start w:val="1"/>
-      <w:numFmt w:val="decimal"/>
-      <w:lvlText w:val="%8."/>
-      <w:lvlJc w:val="left"/>
-      <w:pPr>
-        <w:ind w:left="5760" w:hanging="360"/>
-      </w:pPr>
-    </w:lvl>
-    <w:lvl w:ilvl="8">
-      <w:start w:val="1"/>
-      <w:numFmt w:val="decimal"/>
-      <w:lvlText w:val="%9."/>
-      <w:lvlJc w:val="left"/>
-      <w:pPr>
-        <w:ind w:left="6480" w:hanging="360"/>
-      </w:pPr>
-    </w:lvl>
-  </w:abstractNum>
-  <w:abstractNum w:abstractNumId="2" w15:restartNumberingAfterBreak="0">
     <w:nsid w:val="388F7EDF"/>
     <w:multiLevelType w:val="multilevel"/>
     <w:tmpl w:val="72A241F8"/>
@@ -325,237 +244,9 @@
     </w:lvl>
   </w:abstractNum>
   <w:num w:numId="1" w16cid:durableId="1605264602">
-    <w:abstractNumId w:val="2"/>
-  </w:num>
-  <w:num w:numId="2" w16cid:durableId="716664875">
     <w:abstractNumId w:val="0"/>
   </w:num>
-  <w:num w:numId="3" w16cid:durableId="1064766268">
-    <w:abstractNumId w:val="0"/>
-  </w:num>
-  <w:num w:numId="4" w16cid:durableId="1817649995">
-    <w:abstractNumId w:val="0"/>
-  </w:num>
-  <w:num w:numId="5" w16cid:durableId="1208957727">
-    <w:abstractNumId w:val="0"/>
-  </w:num>
-  <w:num w:numId="6" w16cid:durableId="1009068259">
-    <w:abstractNumId w:val="0"/>
-  </w:num>
-  <w:num w:numId="7" w16cid:durableId="68112723">
-    <w:abstractNumId w:val="0"/>
-  </w:num>
-  <w:num w:numId="8" w16cid:durableId="228225217">
-    <w:abstractNumId w:val="0"/>
-  </w:num>
-  <w:num w:numId="9" w16cid:durableId="629819992">
-    <w:abstractNumId w:val="0"/>
-  </w:num>
-  <w:num w:numId="10" w16cid:durableId="554196157">
-    <w:abstractNumId w:val="1"/>
-    <w:lvlOverride w:ilvl="0">
-      <w:startOverride w:val="1"/>
-    </w:lvlOverride>
-    <w:lvlOverride w:ilvl="1">
-      <w:startOverride w:val="1"/>
-    </w:lvlOverride>
-    <w:lvlOverride w:ilvl="2">
-      <w:startOverride w:val="1"/>
-    </w:lvlOverride>
-    <w:lvlOverride w:ilvl="3">
-      <w:startOverride w:val="1"/>
-    </w:lvlOverride>
-    <w:lvlOverride w:ilvl="4">
-      <w:startOverride w:val="1"/>
-    </w:lvlOverride>
-    <w:lvlOverride w:ilvl="5">
-      <w:startOverride w:val="1"/>
-    </w:lvlOverride>
-    <w:lvlOverride w:ilvl="6">
-      <w:startOverride w:val="1"/>
-    </w:lvlOverride>
-    <w:lvlOverride w:ilvl="7">
-      <w:startOverride w:val="1"/>
-    </w:lvlOverride>
-    <w:lvlOverride w:ilvl="8">
-      <w:startOverride w:val="1"/>
-    </w:lvlOverride>
-  </w:num>
-  <w:num w:numId="11" w16cid:durableId="341468830">
-    <w:abstractNumId w:val="1"/>
-    <w:lvlOverride w:ilvl="0">
-      <w:startOverride w:val="1"/>
-    </w:lvlOverride>
-    <w:lvlOverride w:ilvl="1">
-      <w:startOverride w:val="1"/>
-    </w:lvlOverride>
-    <w:lvlOverride w:ilvl="2">
-      <w:startOverride w:val="1"/>
-    </w:lvlOverride>
-    <w:lvlOverride w:ilvl="3">
-      <w:startOverride w:val="1"/>
-    </w:lvlOverride>
-    <w:lvlOverride w:ilvl="4">
-      <w:startOverride w:val="1"/>
-    </w:lvlOverride>
-    <w:lvlOverride w:ilvl="5">
-      <w:startOverride w:val="1"/>
-    </w:lvlOverride>
-    <w:lvlOverride w:ilvl="6">
-      <w:startOverride w:val="1"/>
-    </w:lvlOverride>
-    <w:lvlOverride w:ilvl="7">
-      <w:startOverride w:val="1"/>
-    </w:lvlOverride>
-    <w:lvlOverride w:ilvl="8">
-      <w:startOverride w:val="1"/>
-    </w:lvlOverride>
-  </w:num>
-  <w:num w:numId="12" w16cid:durableId="396242913">
-    <w:abstractNumId w:val="0"/>
-  </w:num>
-  <w:num w:numId="13" w16cid:durableId="1838114825">
-    <w:abstractNumId w:val="0"/>
-  </w:num>
-  <w:num w:numId="14" w16cid:durableId="292518136">
-    <w:abstractNumId w:val="1"/>
-    <w:lvlOverride w:ilvl="0">
-      <w:startOverride w:val="1"/>
-    </w:lvlOverride>
-    <w:lvlOverride w:ilvl="1">
-      <w:startOverride w:val="1"/>
-    </w:lvlOverride>
-    <w:lvlOverride w:ilvl="2">
-      <w:startOverride w:val="1"/>
-    </w:lvlOverride>
-    <w:lvlOverride w:ilvl="3">
-      <w:startOverride w:val="1"/>
-    </w:lvlOverride>
-    <w:lvlOverride w:ilvl="4">
-      <w:startOverride w:val="1"/>
-    </w:lvlOverride>
-    <w:lvlOverride w:ilvl="5">
-      <w:startOverride w:val="1"/>
-    </w:lvlOverride>
-    <w:lvlOverride w:ilvl="6">
-      <w:startOverride w:val="1"/>
-    </w:lvlOverride>
-    <w:lvlOverride w:ilvl="7">
-      <w:startOverride w:val="1"/>
-    </w:lvlOverride>
-    <w:lvlOverride w:ilvl="8">
-      <w:startOverride w:val="1"/>
-    </w:lvlOverride>
-  </w:num>
-  <w:num w:numId="15" w16cid:durableId="1481262311">
-    <w:abstractNumId w:val="0"/>
-  </w:num>
-  <w:num w:numId="16" w16cid:durableId="593628908">
-    <w:abstractNumId w:val="0"/>
-  </w:num>
-  <w:num w:numId="17" w16cid:durableId="296494077">
-    <w:abstractNumId w:val="0"/>
-  </w:num>
-  <w:num w:numId="18" w16cid:durableId="1376077388">
-    <w:abstractNumId w:val="1"/>
-    <w:lvlOverride w:ilvl="0">
-      <w:startOverride w:val="1"/>
-    </w:lvlOverride>
-    <w:lvlOverride w:ilvl="1">
-      <w:startOverride w:val="1"/>
-    </w:lvlOverride>
-    <w:lvlOverride w:ilvl="2">
-      <w:startOverride w:val="1"/>
-    </w:lvlOverride>
-    <w:lvlOverride w:ilvl="3">
-      <w:startOverride w:val="1"/>
-    </w:lvlOverride>
-    <w:lvlOverride w:ilvl="4">
-      <w:startOverride w:val="1"/>
-    </w:lvlOverride>
-    <w:lvlOverride w:ilvl="5">
-      <w:startOverride w:val="1"/>
-    </w:lvlOverride>
-    <w:lvlOverride w:ilvl="6">
-      <w:startOverride w:val="1"/>
-    </w:lvlOverride>
-    <w:lvlOverride w:ilvl="7">
-      <w:startOverride w:val="1"/>
-    </w:lvlOverride>
-    <w:lvlOverride w:ilvl="8">
-      <w:startOverride w:val="1"/>
-    </w:lvlOverride>
-  </w:num>
-  <w:num w:numId="19" w16cid:durableId="381561253">
-    <w:abstractNumId w:val="0"/>
-  </w:num>
-  <w:num w:numId="20" w16cid:durableId="2104836434">
-    <w:abstractNumId w:val="0"/>
-  </w:num>
-  <w:num w:numId="21" w16cid:durableId="680593872">
-    <w:abstractNumId w:val="0"/>
-  </w:num>
-  <w:num w:numId="22" w16cid:durableId="1597320258">
-    <w:abstractNumId w:val="1"/>
-    <w:lvlOverride w:ilvl="0">
-      <w:startOverride w:val="1"/>
-    </w:lvlOverride>
-    <w:lvlOverride w:ilvl="1">
-      <w:startOverride w:val="1"/>
-    </w:lvlOverride>
-    <w:lvlOverride w:ilvl="2">
-      <w:startOverride w:val="1"/>
-    </w:lvlOverride>
-    <w:lvlOverride w:ilvl="3">
-      <w:startOverride w:val="1"/>
-    </w:lvlOverride>
-    <w:lvlOverride w:ilvl="4">
-      <w:startOverride w:val="1"/>
-    </w:lvlOverride>
-    <w:lvlOverride w:ilvl="5">
-      <w:startOverride w:val="1"/>
-    </w:lvlOverride>
-    <w:lvlOverride w:ilvl="6">
-      <w:startOverride w:val="1"/>
-    </w:lvlOverride>
-    <w:lvlOverride w:ilvl="7">
-      <w:startOverride w:val="1"/>
-    </w:lvlOverride>
-    <w:lvlOverride w:ilvl="8">
-      <w:startOverride w:val="1"/>
-    </w:lvlOverride>
-  </w:num>
-  <w:num w:numId="23" w16cid:durableId="591403331">
-    <w:abstractNumId w:val="1"/>
-    <w:lvlOverride w:ilvl="0">
-      <w:startOverride w:val="1"/>
-    </w:lvlOverride>
-    <w:lvlOverride w:ilvl="1">
-      <w:startOverride w:val="1"/>
-    </w:lvlOverride>
-    <w:lvlOverride w:ilvl="2">
-      <w:startOverride w:val="1"/>
-    </w:lvlOverride>
-    <w:lvlOverride w:ilvl="3">
-      <w:startOverride w:val="1"/>
-    </w:lvlOverride>
-    <w:lvlOverride w:ilvl="4">
-      <w:startOverride w:val="1"/>
-    </w:lvlOverride>
-    <w:lvlOverride w:ilvl="5">
-      <w:startOverride w:val="1"/>
-    </w:lvlOverride>
-    <w:lvlOverride w:ilvl="6">
-      <w:startOverride w:val="1"/>
-    </w:lvlOverride>
-    <w:lvlOverride w:ilvl="7">
-      <w:startOverride w:val="1"/>
-    </w:lvlOverride>
-    <w:lvlOverride w:ilvl="8">
-      <w:startOverride w:val="1"/>
-    </w:lvlOverride>
-  </w:num>
-  <w:numIdMacAtCleanup w:val="23"/>
+  <w:numIdMacAtCleanup w:val="1"/>
 </w:numbering>
 </file>
 
@@ -594,6 +285,7 @@
     <w:lsdException w:name="toc 7" w:uiPriority="39"/>
     <w:lsdException w:name="toc 8" w:uiPriority="39"/>
     <w:lsdException w:name="toc 9" w:uiPriority="39"/>
+    <w:lsdException w:name="footer" w:uiPriority="99"/>
     <w:lsdException w:name="caption" w:uiPriority="35" w:qFormat="1"/>
     <w:lsdException w:name="Title" w:qFormat="1"/>
     <w:lsdException w:name="Subtitle" w:qFormat="1"/>
@@ -2361,6 +2053,46 @@
         <w:insideV w:val="single" w:sz="4" w:space="0" w:color="auto"/>
       </w:tblBorders>
     </w:tblPr>
+  </w:style>
+  <w:style w:type="paragraph" w:styleId="Header">
+    <w:name w:val="header"/>
+    <w:basedOn w:val="Normal"/>
+    <w:link w:val="HeaderChar"/>
+    <w:rsid w:val="0064477C"/>
+    <w:pPr>
+      <w:tabs>
+        <w:tab w:val="center" w:pos="4819"/>
+        <w:tab w:val="right" w:pos="9638"/>
+      </w:tabs>
+      <w:spacing w:before="0" w:after="0" w:line="240" w:lineRule="auto"/>
+    </w:pPr>
+  </w:style>
+  <w:style w:type="character" w:customStyle="1" w:styleId="HeaderChar">
+    <w:name w:val="Header Char"/>
+    <w:basedOn w:val="DefaultParagraphFont"/>
+    <w:link w:val="Header"/>
+    <w:rsid w:val="0064477C"/>
+  </w:style>
+  <w:style w:type="paragraph" w:styleId="Footer">
+    <w:name w:val="footer"/>
+    <w:basedOn w:val="Normal"/>
+    <w:link w:val="FooterChar"/>
+    <w:uiPriority w:val="99"/>
+    <w:rsid w:val="0064477C"/>
+    <w:pPr>
+      <w:tabs>
+        <w:tab w:val="center" w:pos="4819"/>
+        <w:tab w:val="right" w:pos="9638"/>
+      </w:tabs>
+      <w:spacing w:before="0" w:after="0" w:line="240" w:lineRule="auto"/>
+    </w:pPr>
+  </w:style>
+  <w:style w:type="character" w:customStyle="1" w:styleId="FooterChar">
+    <w:name w:val="Footer Char"/>
+    <w:basedOn w:val="DefaultParagraphFont"/>
+    <w:link w:val="Footer"/>
+    <w:uiPriority w:val="99"/>
+    <w:rsid w:val="0064477C"/>
   </w:style>
 </w:styles>
 </file>

</xml_diff>